<commit_message>
Corrected the Contrast Plan
</commit_message>
<xml_diff>
--- a/Standards/OpenDoorDesignStandardsV1.docx
+++ b/Standards/OpenDoorDesignStandardsV1.docx
@@ -322,6 +322,19 @@
     <w:p>
       <w:r>
         <w:t>We build software that people trust. Accessibility is not added after development. It is the foundation upon which every design decision is made. Whenever practical, we exceed minimum accessibility requirements because our goal is not simply to make software accessible. Our goal is to make software understandable, efficient, predictable, and empowering for everyone.</w:t>
+      </w:r>
+    </w:p>
+    <w:p>
+      <w:pPr>
+        <w:pStyle w:val="Heading2"/>
+      </w:pPr>
+      <w:r>
+        <w:t>Color pairing standard</w:t>
+      </w:r>
+    </w:p>
+    <w:p>
+      <w:r>
+        <w:t>Open Door Design projects must not use blue and green together as the primary visual distinction between neighboring interface elements, navigation states, buttons, cards, banners, or important content areas. Passing a contrast checker is required, but it is not enough. Color choices must also be practical for users with common color vision differences. Any color-coded meaning must also be communicated through a non-color cue such as text, underline, border, icon shape, spacing, font weight, or label text.</w:t>
       </w:r>
     </w:p>
     <w:sectPr>

</xml_diff>

<commit_message>
Updated the ODD Design for all products
</commit_message>
<xml_diff>
--- a/Standards/OpenDoorDesignStandardsV1.docx
+++ b/Standards/OpenDoorDesignStandardsV1.docx
@@ -45,17 +45,19 @@
         <w:br/>
         <w:t>- AAA contrast whenever practical.</w:t>
         <w:br/>
-        <w:t>- Body text target: 7:1.</w:t>
+        <w:t>- Body text target: 7:1 or stronger.</w:t>
         <w:br/>
-        <w:t>- Large text target: 4.5:1.</w:t>
+        <w:t>- Preferred readability target: 10:1 where practical.</w:t>
         <w:br/>
-        <w:t>- Controls, icons and focus indicators target: 4.5:1.</w:t>
+        <w:t>- Primary navigation target: 12:1 where practical.</w:t>
         <w:br/>
-        <w:t>- Mobile-first responsive layouts.</w:t>
+        <w:t>- Green is the primary brand accent.</w:t>
         <w:br/>
-        <w:t>- Reflow at 320 CSS pixels required and targeted to remain usable at 280 CSS pixels where practical.</w:t>
+        <w:t>- Blue is not used as a primary interface color.</w:t>
         <w:br/>
-        <w:t>- Consistent colors, typography, spacing, buttons, forms, cards, dialogs and navigation.</w:t>
+        <w:t>- Do not use blue and green together as the primary visual distinction in neighboring interface elements.</w:t>
+        <w:br/>
+        <w:t>- Color must never be the only indicator of meaning, state, or action.</w:t>
       </w:r>
     </w:p>
     <w:p>
@@ -329,12 +331,18 @@
         <w:pStyle w:val="Heading2"/>
       </w:pPr>
       <w:r>
-        <w:t>Color pairing standard</w:t>
+        <w:t>Color and contrast standard</w:t>
       </w:r>
     </w:p>
     <w:p>
       <w:r>
-        <w:t>Open Door Design projects must not use blue and green together as the primary visual distinction between neighboring interface elements, navigation states, buttons, cards, banners, or important content areas. Passing a contrast checker is required, but it is not enough. Color choices must also be practical for users with common color vision differences. Any color-coded meaning must also be communicated through a non-color cue such as text, underline, border, icon shape, spacing, font weight, or label text.</w:t>
+        <w:t>Open Door Design uses WCAG 2.2 AA as the baseline and targets AAA or stronger contrast wherever practical. Normal text should meet 7:1 or better. Primary navigation should target 12:1 or better where practical. The preferred experience is not merely compliant; it should be comfortable, readable, and clear.</w:t>
+        <w:br/>
+        <w:br/>
+        <w:t>Open Door Design projects must not use blue and green together as the primary visual distinction between neighboring interface elements, navigation states, buttons, cards, banners, or important content areas. Passing a contrast checker is required, but it is not enough. Color choices must also be practical for users with common color vision differences.</w:t>
+        <w:br/>
+        <w:br/>
+        <w:t>Green is the primary Open Door Design brand accent. Blue is not part of the primary interface system. Navigation must not use blue links or inherit a blue global link token. Any color-coded meaning must also be communicated through a non-color cue such as text, underline, border, icon shape, spacing, font weight, or label text.</w:t>
       </w:r>
     </w:p>
     <w:sectPr>

</xml_diff>